<commit_message>
Update travel guidelines with revised docx
Nearest station is now Kanjurmarg / Vikhroli only, and the medicines
checklist item asks for a 7-day supply plus common basic medicines.

Co-Authored-By: Claude Opus 5.5 <noreply@anthropic.com>
</commit_message>
<xml_diff>
--- a/assets/Yuva_Sangam_7_Student_Travel_Guidelines.docx
+++ b/assets/Yuva_Sangam_7_Student_Travel_Guidelines.docx
@@ -7,7 +7,6 @@
         <w:spacing w:after="80"/>
         <w:jc w:val="center"/>
       </w:pPr>
-      <w:proofErr w:type="spellStart"/>
       <w:r>
         <w:rPr>
           <w:rFonts w:cs="Calibri"/>
@@ -17,19 +16,7 @@
           <w:sz w:val="40"/>
           <w:szCs w:val="40"/>
         </w:rPr>
-        <w:t>Yuva</w:t>
-      </w:r>
-      <w:proofErr w:type="spellEnd"/>
-      <w:r>
-        <w:rPr>
-          <w:rFonts w:cs="Calibri"/>
-          <w:b/>
-          <w:bCs/>
-          <w:color w:val="1F4E79"/>
-          <w:sz w:val="40"/>
-          <w:szCs w:val="40"/>
-        </w:rPr>
-        <w:t xml:space="preserve"> Sangam 7 – Maharashtra to J&amp;K</w:t>
+        <w:t>Yuva Sangam 7 – Maharashtra to J&amp;K</w:t>
       </w:r>
     </w:p>
     <w:p>
@@ -113,12 +100,6 @@
         <w:gridCol w:w="7438"/>
       </w:tblGrid>
       <w:tr>
-        <w:tblPrEx>
-          <w:tblCellMar>
-            <w:top w:w="0" w:type="dxa"/>
-            <w:bottom w:w="0" w:type="dxa"/>
-          </w:tblCellMar>
-        </w:tblPrEx>
         <w:trPr>
           <w:tblHeader/>
         </w:trPr>
@@ -182,12 +163,6 @@
         </w:tc>
       </w:tr>
       <w:tr>
-        <w:tblPrEx>
-          <w:tblCellMar>
-            <w:top w:w="0" w:type="dxa"/>
-            <w:bottom w:w="0" w:type="dxa"/>
-          </w:tblCellMar>
-        </w:tblPrEx>
         <w:tc>
           <w:tcPr>
             <w:tcW w:w="2200" w:type="dxa"/>
@@ -230,30 +205,16 @@
             </w:tcMar>
           </w:tcPr>
           <w:p>
-            <w:proofErr w:type="spellStart"/>
-            <w:r>
-              <w:rPr>
-                <w:rFonts w:cs="Calibri"/>
-              </w:rPr>
-              <w:t>Yuva</w:t>
-            </w:r>
-            <w:proofErr w:type="spellEnd"/>
-            <w:r>
-              <w:rPr>
-                <w:rFonts w:cs="Calibri"/>
-              </w:rPr>
-              <w:t xml:space="preserve"> Sangam Phase 7 – Maharashtra to Jammu &amp; Kashmir</w:t>
+            <w:r>
+              <w:rPr>
+                <w:rFonts w:cs="Calibri"/>
+              </w:rPr>
+              <w:t>Yuva Sangam Phase 7 – Maharashtra to Jammu &amp; Kashmir</w:t>
             </w:r>
           </w:p>
         </w:tc>
       </w:tr>
       <w:tr>
-        <w:tblPrEx>
-          <w:tblCellMar>
-            <w:top w:w="0" w:type="dxa"/>
-            <w:bottom w:w="0" w:type="dxa"/>
-          </w:tblCellMar>
-        </w:tblPrEx>
         <w:tc>
           <w:tcPr>
             <w:tcW w:w="2200" w:type="dxa"/>
@@ -308,12 +269,6 @@
         </w:tc>
       </w:tr>
       <w:tr>
-        <w:tblPrEx>
-          <w:tblCellMar>
-            <w:top w:w="0" w:type="dxa"/>
-            <w:bottom w:w="0" w:type="dxa"/>
-          </w:tblCellMar>
-        </w:tblPrEx>
         <w:tc>
           <w:tcPr>
             <w:tcW w:w="2200" w:type="dxa"/>
@@ -366,12 +321,6 @@
         </w:tc>
       </w:tr>
       <w:tr>
-        <w:tblPrEx>
-          <w:tblCellMar>
-            <w:top w:w="0" w:type="dxa"/>
-            <w:bottom w:w="0" w:type="dxa"/>
-          </w:tblCellMar>
-        </w:tblPrEx>
         <w:tc>
           <w:tcPr>
             <w:tcW w:w="2200" w:type="dxa"/>
@@ -426,12 +375,6 @@
         </w:tc>
       </w:tr>
       <w:tr>
-        <w:tblPrEx>
-          <w:tblCellMar>
-            <w:top w:w="0" w:type="dxa"/>
-            <w:bottom w:w="0" w:type="dxa"/>
-          </w:tblCellMar>
-        </w:tblPrEx>
         <w:tc>
           <w:tcPr>
             <w:tcW w:w="2200" w:type="dxa"/>
@@ -484,12 +427,6 @@
         </w:tc>
       </w:tr>
       <w:tr>
-        <w:tblPrEx>
-          <w:tblCellMar>
-            <w:top w:w="0" w:type="dxa"/>
-            <w:bottom w:w="0" w:type="dxa"/>
-          </w:tblCellMar>
-        </w:tblPrEx>
         <w:tc>
           <w:tcPr>
             <w:tcW w:w="2200" w:type="dxa"/>
@@ -554,12 +491,6 @@
         </w:tc>
       </w:tr>
       <w:tr>
-        <w:tblPrEx>
-          <w:tblCellMar>
-            <w:top w:w="0" w:type="dxa"/>
-            <w:bottom w:w="0" w:type="dxa"/>
-          </w:tblCellMar>
-        </w:tblPrEx>
         <w:tc>
           <w:tcPr>
             <w:tcW w:w="2200" w:type="dxa"/>
@@ -652,25 +583,7 @@
         <w:rPr>
           <w:rFonts w:cs="Calibri"/>
         </w:rPr>
-        <w:t>Arrive at IIT Bombay by 4:00 PM on 20 October; the bus to the airport leaves at 9</w:t>
-      </w:r>
-      <w:r>
-        <w:rPr>
-          <w:rFonts w:cs="Calibri"/>
-        </w:rPr>
-        <w:t>:00</w:t>
-      </w:r>
-      <w:r>
-        <w:rPr>
-          <w:rFonts w:cs="Calibri"/>
-        </w:rPr>
-        <w:t xml:space="preserve"> AM </w:t>
-      </w:r>
-      <w:r>
-        <w:rPr>
-          <w:rFonts w:cs="Calibri"/>
-        </w:rPr>
-        <w:t>on 21 October.</w:t>
+        <w:t>Arrive at IIT Bombay by 4:00 PM on 20 October; the bus to the airport leaves at 9:00 AM on 21 October.</w:t>
       </w:r>
     </w:p>
     <w:tbl>
@@ -697,12 +610,6 @@
         <w:gridCol w:w="2500"/>
       </w:tblGrid>
       <w:tr>
-        <w:tblPrEx>
-          <w:tblCellMar>
-            <w:top w:w="0" w:type="dxa"/>
-            <w:bottom w:w="0" w:type="dxa"/>
-          </w:tblCellMar>
-        </w:tblPrEx>
         <w:trPr>
           <w:tblHeader/>
         </w:trPr>
@@ -824,12 +731,6 @@
         </w:tc>
       </w:tr>
       <w:tr>
-        <w:tblPrEx>
-          <w:tblCellMar>
-            <w:top w:w="0" w:type="dxa"/>
-            <w:bottom w:w="0" w:type="dxa"/>
-          </w:tblCellMar>
-        </w:tblPrEx>
         <w:tc>
           <w:tcPr>
             <w:tcW w:w="1500" w:type="dxa"/>
@@ -901,13 +802,7 @@
               <w:rPr>
                 <w:rFonts w:cs="Calibri"/>
               </w:rPr>
-              <w:t>Arrive at IIT Bombay, contact volunteers for hostel room allotment</w:t>
-            </w:r>
-            <w:r>
-              <w:rPr>
-                <w:rFonts w:cs="Calibri"/>
-              </w:rPr>
-              <w:t>, drop luggage</w:t>
+              <w:t>Arrive at IIT Bombay, contact volunteers for hostel room allotment, drop luggage</w:t>
             </w:r>
           </w:p>
         </w:tc>
@@ -938,12 +833,6 @@
         </w:tc>
       </w:tr>
       <w:tr>
-        <w:tblPrEx>
-          <w:tblCellMar>
-            <w:top w:w="0" w:type="dxa"/>
-            <w:bottom w:w="0" w:type="dxa"/>
-          </w:tblCellMar>
-        </w:tblPrEx>
         <w:tc>
           <w:tcPr>
             <w:tcW w:w="1500" w:type="dxa"/>
@@ -1018,13 +907,7 @@
               <w:rPr>
                 <w:rFonts w:cs="Calibri"/>
               </w:rPr>
-              <w:t xml:space="preserve">Reach IRF, SAC for an </w:t>
-            </w:r>
-            <w:r>
-              <w:rPr>
-                <w:rFonts w:cs="Calibri"/>
-              </w:rPr>
-              <w:t>Orientation session with IIT Bombay officials (attendance compulsory)</w:t>
+              <w:t>Reach IRF, SAC for an Orientation session with IIT Bombay officials (attendance compulsory)</w:t>
             </w:r>
           </w:p>
         </w:tc>
@@ -1053,12 +936,6 @@
         </w:tc>
       </w:tr>
       <w:tr>
-        <w:tblPrEx>
-          <w:tblCellMar>
-            <w:top w:w="0" w:type="dxa"/>
-            <w:bottom w:w="0" w:type="dxa"/>
-          </w:tblCellMar>
-        </w:tblPrEx>
         <w:tc>
           <w:tcPr>
             <w:tcW w:w="1500" w:type="dxa"/>
@@ -1161,12 +1038,6 @@
         </w:tc>
       </w:tr>
       <w:tr>
-        <w:tblPrEx>
-          <w:tblCellMar>
-            <w:top w:w="0" w:type="dxa"/>
-            <w:bottom w:w="0" w:type="dxa"/>
-          </w:tblCellMar>
-        </w:tblPrEx>
         <w:tc>
           <w:tcPr>
             <w:tcW w:w="1500" w:type="dxa"/>
@@ -1241,13 +1112,7 @@
               <w:rPr>
                 <w:rFonts w:cs="Calibri"/>
               </w:rPr>
-              <w:t>Web check-in at hostel by volunteers</w:t>
-            </w:r>
-            <w:r>
-              <w:rPr>
-                <w:rFonts w:cs="Calibri"/>
-              </w:rPr>
-              <w:t xml:space="preserve"> – bring your phone and ID</w:t>
+              <w:t>Web check-in at hostel by volunteers – bring your phone and ID</w:t>
             </w:r>
           </w:p>
         </w:tc>
@@ -1279,12 +1144,6 @@
         </w:tc>
       </w:tr>
       <w:tr>
-        <w:tblPrEx>
-          <w:tblCellMar>
-            <w:top w:w="0" w:type="dxa"/>
-            <w:bottom w:w="0" w:type="dxa"/>
-          </w:tblCellMar>
-        </w:tblPrEx>
         <w:tc>
           <w:tcPr>
             <w:tcW w:w="1500" w:type="dxa"/>
@@ -1387,12 +1246,6 @@
         </w:tc>
       </w:tr>
       <w:tr>
-        <w:tblPrEx>
-          <w:tblCellMar>
-            <w:top w:w="0" w:type="dxa"/>
-            <w:bottom w:w="0" w:type="dxa"/>
-          </w:tblCellMar>
-        </w:tblPrEx>
         <w:tc>
           <w:tcPr>
             <w:tcW w:w="1500" w:type="dxa"/>
@@ -1467,13 +1320,7 @@
               <w:rPr>
                 <w:rFonts w:cs="Calibri"/>
               </w:rPr>
-              <w:t>Bus picks you up from your allotted hostel – be outside with</w:t>
-            </w:r>
-            <w:r>
-              <w:rPr>
-                <w:rFonts w:cs="Calibri"/>
-              </w:rPr>
-              <w:t xml:space="preserve"> luggage</w:t>
+              <w:t>Bus picks you up from your allotted hostel – be outside with luggage</w:t>
             </w:r>
           </w:p>
         </w:tc>
@@ -1505,12 +1352,6 @@
         </w:tc>
       </w:tr>
       <w:tr>
-        <w:tblPrEx>
-          <w:tblCellMar>
-            <w:top w:w="0" w:type="dxa"/>
-            <w:bottom w:w="0" w:type="dxa"/>
-          </w:tblCellMar>
-        </w:tblPrEx>
         <w:tc>
           <w:tcPr>
             <w:tcW w:w="1500" w:type="dxa"/>
@@ -1613,12 +1454,6 @@
         </w:tc>
       </w:tr>
       <w:tr>
-        <w:tblPrEx>
-          <w:tblCellMar>
-            <w:top w:w="0" w:type="dxa"/>
-            <w:bottom w:w="0" w:type="dxa"/>
-          </w:tblCellMar>
-        </w:tblPrEx>
         <w:tc>
           <w:tcPr>
             <w:tcW w:w="1500" w:type="dxa"/>
@@ -1725,12 +1560,6 @@
         </w:tc>
       </w:tr>
       <w:tr>
-        <w:tblPrEx>
-          <w:tblCellMar>
-            <w:top w:w="0" w:type="dxa"/>
-            <w:bottom w:w="0" w:type="dxa"/>
-          </w:tblCellMar>
-        </w:tblPrEx>
         <w:tc>
           <w:tcPr>
             <w:tcW w:w="1500" w:type="dxa"/>
@@ -1872,13 +1701,7 @@
         <w:rPr>
           <w:rFonts w:cs="Calibri"/>
         </w:rPr>
-        <w:t>We travel as one group: IITB bus to Mumbai Airport, then IndiGo</w:t>
-      </w:r>
-      <w:r>
-        <w:rPr>
-          <w:rFonts w:cs="Calibri"/>
-        </w:rPr>
-        <w:t xml:space="preserve"> to Srinagar. No one travels to the airport separately.</w:t>
+        <w:t>We travel as one group: IITB bus to Mumbai Airport, then IndiGo to Srinagar. No one travels to the airport separately.</w:t>
       </w:r>
     </w:p>
     <w:p>
@@ -1898,7 +1721,7 @@
         <w:t>Reach IIT Bombay on your own</w:t>
       </w:r>
       <w:r>
-        <w:t xml:space="preserve"> by 4:00 PM on 20 October. Nearest stations: Kanjurmarg / Vikhroli (Central line) or Powai via Ghatkopar Metro. Report at the main gate desk.</w:t>
+        <w:t xml:space="preserve"> by 4:00 PM on 20 October. The nearest station is Kanjurmarg / Vikhroli on the Central Railway line. Report at the main gate desk.</w:t>
       </w:r>
     </w:p>
     <w:p>
@@ -1918,10 +1741,7 @@
         <w:t>Stay in your allotted hostel</w:t>
       </w:r>
       <w:r>
-        <w:t xml:space="preserve"> f</w:t>
-      </w:r>
-      <w:r>
-        <w:t>or the night. Do not leave campus after the orientation.</w:t>
+        <w:t xml:space="preserve"> for the night. Do not leave campus after the orientation.</w:t>
       </w:r>
     </w:p>
     <w:p>
@@ -1938,14 +1758,7 @@
           <w:b/>
           <w:bCs/>
         </w:rPr>
-        <w:t>Be outside your hostel at 8:15</w:t>
-      </w:r>
-      <w:r>
-        <w:rPr>
-          <w:b/>
-          <w:bCs/>
-        </w:rPr>
-        <w:t xml:space="preserve"> AM on 21 October</w:t>
+        <w:t>Be outside your hostel at 8:15 AM on 21 October</w:t>
       </w:r>
       <w:r>
         <w:t xml:space="preserve"> with all luggage. The bus picks you up there.</w:t>
@@ -1985,21 +1798,7 @@
           <w:b/>
           <w:bCs/>
         </w:rPr>
-        <w:t xml:space="preserve">Bus leaves at 9:00 </w:t>
-      </w:r>
-      <w:r>
-        <w:rPr>
-          <w:b/>
-          <w:bCs/>
-        </w:rPr>
-        <w:t>AM</w:t>
-      </w:r>
-      <w:r>
-        <w:rPr>
-          <w:b/>
-          <w:bCs/>
-        </w:rPr>
-        <w:t>.</w:t>
+        <w:t>Bus leaves at 9:00 AM.</w:t>
       </w:r>
       <w:r>
         <w:t xml:space="preserve"> Late arrivals will not be waited for.</w:t>
@@ -2060,17 +1859,7 @@
           <w:sz w:val="28"/>
           <w:szCs w:val="28"/>
         </w:rPr>
-        <w:t>Baggag</w:t>
-      </w:r>
-      <w:r>
-        <w:rPr>
-          <w:b/>
-          <w:bCs/>
-          <w:color w:val="1F4E79"/>
-          <w:sz w:val="28"/>
-          <w:szCs w:val="28"/>
-        </w:rPr>
-        <w:t>e rules (IndiGo, Mumbai–Srinagar)</w:t>
+        <w:t>Baggage rules (IndiGo, Mumbai–Srinagar)</w:t>
       </w:r>
     </w:p>
     <w:p>
@@ -2135,12 +1924,6 @@
         <w:gridCol w:w="4138"/>
       </w:tblGrid>
       <w:tr>
-        <w:tblPrEx>
-          <w:tblCellMar>
-            <w:top w:w="0" w:type="dxa"/>
-            <w:bottom w:w="0" w:type="dxa"/>
-          </w:tblCellMar>
-        </w:tblPrEx>
         <w:trPr>
           <w:tblHeader/>
         </w:trPr>
@@ -2233,12 +2016,6 @@
         </w:tc>
       </w:tr>
       <w:tr>
-        <w:tblPrEx>
-          <w:tblCellMar>
-            <w:top w:w="0" w:type="dxa"/>
-            <w:bottom w:w="0" w:type="dxa"/>
-          </w:tblCellMar>
-        </w:tblPrEx>
         <w:tc>
           <w:tcPr>
             <w:tcW w:w="2000" w:type="dxa"/>
@@ -2316,12 +2093,6 @@
         </w:tc>
       </w:tr>
       <w:tr>
-        <w:tblPrEx>
-          <w:tblCellMar>
-            <w:top w:w="0" w:type="dxa"/>
-            <w:bottom w:w="0" w:type="dxa"/>
-          </w:tblCellMar>
-        </w:tblPrEx>
         <w:tc>
           <w:tcPr>
             <w:tcW w:w="2000" w:type="dxa"/>
@@ -2402,12 +2173,6 @@
         </w:tc>
       </w:tr>
       <w:tr>
-        <w:tblPrEx>
-          <w:tblCellMar>
-            <w:top w:w="0" w:type="dxa"/>
-            <w:bottom w:w="0" w:type="dxa"/>
-          </w:tblCellMar>
-        </w:tblPrEx>
         <w:tc>
           <w:tcPr>
             <w:tcW w:w="2000" w:type="dxa"/>
@@ -2562,15 +2327,7 @@
         <w:spacing w:after="60"/>
       </w:pPr>
       <w:r>
-        <w:t>Put a name tag with your name, phone and "</w:t>
-      </w:r>
-      <w:proofErr w:type="spellStart"/>
-      <w:r>
-        <w:t>Yuva</w:t>
-      </w:r>
-      <w:proofErr w:type="spellEnd"/>
-      <w:r>
-        <w:t xml:space="preserve"> Sangam – Maharashtra" on both bags.</w:t>
+        <w:t>Put a name tag with your name, phone and "Yuva Sangam – Maharashtra" on both bags.</w:t>
       </w:r>
     </w:p>
     <w:p>
@@ -2601,13 +2358,7 @@
         <w:rPr>
           <w:rFonts w:cs="Calibri"/>
         </w:rPr>
-        <w:t>Rules can change. Refer</w:t>
-      </w:r>
-      <w:r>
-        <w:rPr>
-          <w:rFonts w:cs="Calibri"/>
-        </w:rPr>
-        <w:t xml:space="preserve"> </w:t>
+        <w:t xml:space="preserve">Rules can change. Refer </w:t>
       </w:r>
       <w:hyperlink r:id="rId6" w:history="1">
         <w:r>
@@ -2652,8 +2403,346 @@
           <w:sz w:val="28"/>
           <w:szCs w:val="28"/>
         </w:rPr>
-        <w:t xml:space="preserve">Srinagar weather </w:t>
-      </w:r>
+        <w:t>Srinagar weather (20–27 Oct) and essentials to carry</w:t>
+      </w:r>
+    </w:p>
+    <w:p>
+      <w:pPr>
+        <w:spacing w:after="120"/>
+      </w:pPr>
+      <w:r>
+        <w:rPr>
+          <w:rFonts w:cs="Calibri"/>
+        </w:rPr>
+        <w:t xml:space="preserve">Expect cold, dry weather: about </w:t>
+      </w:r>
+      <w:r>
+        <w:rPr>
+          <w:rFonts w:cs="Calibri"/>
+          <w:b/>
+          <w:bCs/>
+        </w:rPr>
+        <w:t>17–20°C in the afternoon</w:t>
+      </w:r>
+      <w:r>
+        <w:rPr>
+          <w:rFonts w:cs="Calibri"/>
+        </w:rPr>
+        <w:t xml:space="preserve"> and </w:t>
+      </w:r>
+      <w:r>
+        <w:rPr>
+          <w:rFonts w:cs="Calibri"/>
+          <w:b/>
+          <w:bCs/>
+        </w:rPr>
+        <w:t>4–7°C at night and early morning</w:t>
+      </w:r>
+      <w:r>
+        <w:rPr>
+          <w:rFonts w:cs="Calibri"/>
+        </w:rPr>
+        <w:t>. Late October is one of the driest periods of the year, but evenings turn chilly fast and it can be colder at higher spots like Gulmarg or Sonamarg.</w:t>
+      </w:r>
+    </w:p>
+    <w:p>
+      <w:pPr>
+        <w:spacing w:after="120"/>
+      </w:pPr>
+      <w:r>
+        <w:rPr>
+          <w:rFonts w:cs="Calibri"/>
+          <w:b/>
+          <w:bCs/>
+        </w:rPr>
+        <w:t>Dress in layers. Routine clothes alone will not be enough.</w:t>
+      </w:r>
+    </w:p>
+    <w:p>
+      <w:pPr>
+        <w:spacing w:after="60"/>
+        <w:ind w:left="360"/>
+      </w:pPr>
+      <w:r>
+        <w:rPr>
+          <w:rFonts w:cs="Calibri"/>
+          <w:sz w:val="24"/>
+          <w:szCs w:val="24"/>
+        </w:rPr>
+        <w:t xml:space="preserve">☐  </w:t>
+      </w:r>
+      <w:r>
+        <w:rPr>
+          <w:rFonts w:cs="Calibri"/>
+        </w:rPr>
+        <w:t>1 heavy jacket (padded or fleece-lined)</w:t>
+      </w:r>
+    </w:p>
+    <w:p>
+      <w:pPr>
+        <w:spacing w:after="60"/>
+        <w:ind w:left="360"/>
+      </w:pPr>
+      <w:r>
+        <w:rPr>
+          <w:rFonts w:cs="Calibri"/>
+          <w:sz w:val="24"/>
+          <w:szCs w:val="24"/>
+        </w:rPr>
+        <w:t xml:space="preserve">☐  </w:t>
+      </w:r>
+      <w:r>
+        <w:rPr>
+          <w:rFonts w:cs="Calibri"/>
+        </w:rPr>
+        <w:t>2 sweaters / sweatshirts or fleece</w:t>
+      </w:r>
+    </w:p>
+    <w:p>
+      <w:pPr>
+        <w:spacing w:after="60"/>
+        <w:ind w:left="360"/>
+      </w:pPr>
+      <w:r>
+        <w:rPr>
+          <w:rFonts w:cs="Calibri"/>
+          <w:sz w:val="24"/>
+          <w:szCs w:val="24"/>
+        </w:rPr>
+        <w:t xml:space="preserve">☐  </w:t>
+      </w:r>
+      <w:r>
+        <w:rPr>
+          <w:rFonts w:cs="Calibri"/>
+        </w:rPr>
+        <w:t>2 thermal inner sets</w:t>
+      </w:r>
+    </w:p>
+    <w:p>
+      <w:pPr>
+        <w:spacing w:after="60"/>
+        <w:ind w:left="360"/>
+      </w:pPr>
+      <w:r>
+        <w:rPr>
+          <w:rFonts w:cs="Calibri"/>
+          <w:sz w:val="24"/>
+          <w:szCs w:val="24"/>
+        </w:rPr>
+        <w:t xml:space="preserve">☐  </w:t>
+      </w:r>
+      <w:r>
+        <w:rPr>
+          <w:rFonts w:cs="Calibri"/>
+        </w:rPr>
+        <w:t>Woollen cap, gloves, muffler</w:t>
+      </w:r>
+    </w:p>
+    <w:p>
+      <w:pPr>
+        <w:spacing w:after="60"/>
+        <w:ind w:left="360"/>
+      </w:pPr>
+      <w:r>
+        <w:rPr>
+          <w:rFonts w:cs="Calibri"/>
+          <w:sz w:val="24"/>
+          <w:szCs w:val="24"/>
+        </w:rPr>
+        <w:t xml:space="preserve">☐  </w:t>
+      </w:r>
+      <w:r>
+        <w:rPr>
+          <w:rFonts w:cs="Calibri"/>
+        </w:rPr>
+        <w:t>Woollen socks (3–4 pairs)</w:t>
+      </w:r>
+    </w:p>
+    <w:p>
+      <w:pPr>
+        <w:spacing w:after="60"/>
+        <w:ind w:left="360"/>
+      </w:pPr>
+      <w:r>
+        <w:rPr>
+          <w:rFonts w:cs="Calibri"/>
+          <w:sz w:val="24"/>
+          <w:szCs w:val="24"/>
+        </w:rPr>
+        <w:t xml:space="preserve">☐  </w:t>
+      </w:r>
+      <w:r>
+        <w:rPr>
+          <w:rFonts w:cs="Calibri"/>
+        </w:rPr>
+        <w:t>Comfortable closed walking shoes / sports shoes</w:t>
+      </w:r>
+    </w:p>
+    <w:p>
+      <w:pPr>
+        <w:spacing w:after="60"/>
+        <w:ind w:left="360"/>
+      </w:pPr>
+      <w:r>
+        <w:rPr>
+          <w:rFonts w:cs="Calibri"/>
+          <w:sz w:val="24"/>
+          <w:szCs w:val="24"/>
+        </w:rPr>
+        <w:lastRenderedPageBreak/>
+        <w:t xml:space="preserve">☐  </w:t>
+      </w:r>
+      <w:r>
+        <w:rPr>
+          <w:rFonts w:cs="Calibri"/>
+        </w:rPr>
+        <w:t>Full-length clothing for 7 days; one set of formal or traditional wear for cultural events</w:t>
+      </w:r>
+    </w:p>
+    <w:p>
+      <w:pPr>
+        <w:spacing w:after="60"/>
+        <w:ind w:left="360"/>
+      </w:pPr>
+      <w:r>
+        <w:rPr>
+          <w:rFonts w:cs="Calibri"/>
+          <w:sz w:val="24"/>
+          <w:szCs w:val="24"/>
+        </w:rPr>
+        <w:t xml:space="preserve">☐  </w:t>
+      </w:r>
+      <w:r>
+        <w:rPr>
+          <w:rFonts w:cs="Calibri"/>
+        </w:rPr>
+        <w:t>Moisturiser, lip balm, sunscreen (dry air, strong sun)</w:t>
+      </w:r>
+    </w:p>
+    <w:p>
+      <w:pPr>
+        <w:spacing w:after="60"/>
+        <w:ind w:left="360"/>
+      </w:pPr>
+      <w:proofErr w:type="gramStart"/>
+      <w:r>
+        <w:rPr>
+          <w:rFonts w:cs="Calibri"/>
+          <w:sz w:val="24"/>
+          <w:szCs w:val="24"/>
+        </w:rPr>
+        <w:t xml:space="preserve">☐  </w:t>
+      </w:r>
+      <w:r>
+        <w:rPr>
+          <w:rFonts w:cs="Calibri"/>
+          <w:b/>
+          <w:bCs/>
+        </w:rPr>
+        <w:t>Pe</w:t>
+      </w:r>
+      <w:bookmarkStart w:id="0" w:name="_GoBack"/>
+      <w:bookmarkEnd w:id="0"/>
+      <w:r>
+        <w:rPr>
+          <w:rFonts w:cs="Calibri"/>
+          <w:b/>
+          <w:bCs/>
+        </w:rPr>
+        <w:t>rsonal</w:t>
+      </w:r>
+      <w:proofErr w:type="gramEnd"/>
+      <w:r>
+        <w:rPr>
+          <w:rFonts w:cs="Calibri"/>
+          <w:b/>
+          <w:bCs/>
+        </w:rPr>
+        <w:t xml:space="preserve"> medicines for the full 7 days</w:t>
+      </w:r>
+      <w:r>
+        <w:rPr>
+          <w:rFonts w:cs="Calibri"/>
+        </w:rPr>
+        <w:t xml:space="preserve"> (any regular medicines, with prescription), plus basic medicines for cold, fever, headache, acidity and travel sickness</w:t>
+      </w:r>
+    </w:p>
+    <w:p>
+      <w:pPr>
+        <w:spacing w:after="60"/>
+        <w:ind w:left="360"/>
+      </w:pPr>
+      <w:proofErr w:type="gramStart"/>
+      <w:r>
+        <w:rPr>
+          <w:rFonts w:cs="Calibri"/>
+          <w:sz w:val="24"/>
+          <w:szCs w:val="24"/>
+        </w:rPr>
+        <w:t xml:space="preserve">☐  </w:t>
+      </w:r>
+      <w:r>
+        <w:rPr>
+          <w:rFonts w:cs="Calibri"/>
+        </w:rPr>
+        <w:t>Water</w:t>
+      </w:r>
+      <w:proofErr w:type="gramEnd"/>
+      <w:r>
+        <w:rPr>
+          <w:rFonts w:cs="Calibri"/>
+        </w:rPr>
+        <w:t xml:space="preserve"> bottle, small torch, umbrella or light raincoat</w:t>
+      </w:r>
+    </w:p>
+    <w:p>
+      <w:pPr>
+        <w:spacing w:after="60"/>
+        <w:ind w:left="360"/>
+      </w:pPr>
+      <w:r>
+        <w:rPr>
+          <w:rFonts w:cs="Calibri"/>
+          <w:sz w:val="24"/>
+          <w:szCs w:val="24"/>
+        </w:rPr>
+        <w:t xml:space="preserve">☐  </w:t>
+      </w:r>
+      <w:r>
+        <w:rPr>
+          <w:rFonts w:cs="Calibri"/>
+        </w:rPr>
+        <w:t>Phone charger and power bank (cabin bag)</w:t>
+      </w:r>
+    </w:p>
+    <w:p>
+      <w:pPr>
+        <w:spacing w:after="60"/>
+        <w:ind w:left="360"/>
+      </w:pPr>
+      <w:r>
+        <w:rPr>
+          <w:rFonts w:cs="Calibri"/>
+          <w:sz w:val="24"/>
+          <w:szCs w:val="24"/>
+        </w:rPr>
+        <w:t xml:space="preserve">☐  </w:t>
+      </w:r>
+      <w:r>
+        <w:rPr>
+          <w:rFonts w:cs="Calibri"/>
+        </w:rPr>
+        <w:t>Small backpack for day trips</w:t>
+      </w:r>
+    </w:p>
+    <w:p>
+      <w:pPr>
+        <w:pStyle w:val="Heading1"/>
+        <w:pBdr>
+          <w:bottom w:val="single" w:sz="6" w:space="2" w:color="1F4E79"/>
+        </w:pBdr>
+        <w:spacing w:before="280" w:after="120"/>
+      </w:pPr>
       <w:r>
         <w:rPr>
           <w:b/>
@@ -2662,7 +2751,7 @@
           <w:sz w:val="28"/>
           <w:szCs w:val="28"/>
         </w:rPr>
-        <w:t>(20–27 Oct) and essentials to carry</w:t>
+        <w:t>Documents, phones and valuables</w:t>
       </w:r>
     </w:p>
     <w:p>
@@ -2673,846 +2762,178 @@
         <w:rPr>
           <w:rFonts w:cs="Calibri"/>
         </w:rPr>
-        <w:t xml:space="preserve">Expect cold, dry weather: about </w:t>
-      </w:r>
+        <w:t>Carry an original photo ID and photos; without a valid ID you will not be allowed to board.</w:t>
+      </w:r>
+    </w:p>
+    <w:p>
+      <w:pPr>
+        <w:spacing w:before="120" w:after="60"/>
+      </w:pPr>
       <w:r>
         <w:rPr>
           <w:rFonts w:cs="Calibri"/>
           <w:b/>
           <w:bCs/>
         </w:rPr>
-        <w:t>17–20°C in the afternoon</w:t>
-      </w:r>
-      <w:r>
-        <w:rPr>
-          <w:rFonts w:cs="Calibri"/>
-        </w:rPr>
-        <w:t xml:space="preserve"> and </w:t>
-      </w:r>
+        <w:t>Documents to carry</w:t>
+      </w:r>
+    </w:p>
+    <w:p>
+      <w:pPr>
+        <w:spacing w:after="60"/>
+        <w:ind w:left="360"/>
+      </w:pPr>
+      <w:r>
+        <w:rPr>
+          <w:rFonts w:cs="Calibri"/>
+          <w:sz w:val="24"/>
+          <w:szCs w:val="24"/>
+        </w:rPr>
+        <w:t xml:space="preserve">☐  </w:t>
+      </w:r>
+      <w:r>
+        <w:rPr>
+          <w:rFonts w:cs="Calibri"/>
+        </w:rPr>
+        <w:t>Original government photo ID: Aadhaar card (mandatory), plus PAN / Voter ID / Passport / Driving Licence if available</w:t>
+      </w:r>
+    </w:p>
+    <w:p>
+      <w:pPr>
+        <w:spacing w:after="60"/>
+        <w:ind w:left="360"/>
+      </w:pPr>
+      <w:r>
+        <w:rPr>
+          <w:rFonts w:cs="Calibri"/>
+          <w:sz w:val="24"/>
+          <w:szCs w:val="24"/>
+        </w:rPr>
+        <w:t xml:space="preserve">☐  </w:t>
+      </w:r>
+      <w:r>
+        <w:rPr>
+          <w:rFonts w:cs="Calibri"/>
+        </w:rPr>
+        <w:t>College ID card</w:t>
+      </w:r>
+    </w:p>
+    <w:p>
+      <w:pPr>
+        <w:spacing w:after="60"/>
+        <w:ind w:left="360"/>
+      </w:pPr>
+      <w:r>
+        <w:rPr>
+          <w:rFonts w:cs="Calibri"/>
+          <w:sz w:val="24"/>
+          <w:szCs w:val="24"/>
+        </w:rPr>
+        <w:t xml:space="preserve">☐  </w:t>
+      </w:r>
+      <w:r>
+        <w:rPr>
+          <w:rFonts w:cs="Calibri"/>
+        </w:rPr>
+        <w:t>2 photocopies of your Aadhaar and college ID</w:t>
+      </w:r>
+    </w:p>
+    <w:p>
+      <w:pPr>
+        <w:spacing w:after="60"/>
+        <w:ind w:left="360"/>
+      </w:pPr>
+      <w:r>
+        <w:rPr>
+          <w:rFonts w:cs="Calibri"/>
+          <w:sz w:val="24"/>
+          <w:szCs w:val="24"/>
+        </w:rPr>
+        <w:t xml:space="preserve">☐  </w:t>
+      </w:r>
+      <w:r>
+        <w:rPr>
+          <w:rFonts w:cs="Calibri"/>
+        </w:rPr>
+        <w:t>4 recent passport-size photographs</w:t>
+      </w:r>
+    </w:p>
+    <w:p>
+      <w:pPr>
+        <w:spacing w:after="60"/>
+        <w:ind w:left="360"/>
+      </w:pPr>
+      <w:r>
+        <w:rPr>
+          <w:rFonts w:cs="Calibri"/>
+          <w:sz w:val="24"/>
+          <w:szCs w:val="24"/>
+        </w:rPr>
+        <w:t xml:space="preserve">☐  </w:t>
+      </w:r>
+      <w:r>
+        <w:rPr>
+          <w:rFonts w:cs="Calibri"/>
+        </w:rPr>
+        <w:t>Gate pass (from email) and boarding pass – on phone and printed</w:t>
+      </w:r>
+    </w:p>
+    <w:p>
+      <w:pPr>
+        <w:spacing w:after="60"/>
+        <w:ind w:left="360"/>
+      </w:pPr>
+      <w:r>
+        <w:rPr>
+          <w:rFonts w:cs="Calibri"/>
+          <w:sz w:val="24"/>
+          <w:szCs w:val="24"/>
+        </w:rPr>
+        <w:t xml:space="preserve">☐  </w:t>
+      </w:r>
+      <w:r>
+        <w:rPr>
+          <w:rFonts w:cs="Calibri"/>
+        </w:rPr>
+        <w:t>Signed undertaking form (see below)</w:t>
+      </w:r>
+    </w:p>
+    <w:p>
+      <w:pPr>
+        <w:spacing w:before="160" w:after="60"/>
+      </w:pPr>
       <w:r>
         <w:rPr>
           <w:rFonts w:cs="Calibri"/>
           <w:b/>
           <w:bCs/>
         </w:rPr>
-        <w:t>4–7°C at night and early morning</w:t>
-      </w:r>
-      <w:r>
-        <w:rPr>
-          <w:rFonts w:cs="Calibri"/>
-        </w:rPr>
-        <w:t>. Late October is one of the driest periods of the year, but evenings turn chilly fast and it can be colder at higher spots lik</w:t>
-      </w:r>
-      <w:r>
-        <w:rPr>
-          <w:rFonts w:cs="Calibri"/>
-        </w:rPr>
-        <w:t xml:space="preserve">e Gulmarg or </w:t>
-      </w:r>
-      <w:proofErr w:type="spellStart"/>
-      <w:r>
-        <w:rPr>
-          <w:rFonts w:cs="Calibri"/>
-        </w:rPr>
-        <w:t>Sonamarg</w:t>
-      </w:r>
-      <w:proofErr w:type="spellEnd"/>
-      <w:r>
-        <w:rPr>
-          <w:rFonts w:cs="Calibri"/>
-        </w:rPr>
-        <w:t>.</w:t>
+        <w:t>Mobile phones</w:t>
       </w:r>
     </w:p>
     <w:p>
       <w:pPr>
         <w:spacing w:after="120"/>
       </w:pPr>
+      <w:r>
+        <w:rPr>
+          <w:rFonts w:cs="Calibri"/>
+        </w:rPr>
+        <w:t xml:space="preserve">Only </w:t>
+      </w:r>
       <w:r>
         <w:rPr>
           <w:rFonts w:cs="Calibri"/>
           <w:b/>
           <w:bCs/>
         </w:rPr>
-        <w:t>Dress in layers. Routine clothes alone will not be enough.</w:t>
-      </w:r>
-    </w:p>
-    <w:p>
-      <w:pPr>
-        <w:spacing w:after="60"/>
-        <w:ind w:left="360"/>
-      </w:pPr>
-      <w:proofErr w:type="gramStart"/>
-      <w:r>
-        <w:rPr>
-          <w:rFonts w:cs="Calibri"/>
-          <w:sz w:val="24"/>
-          <w:szCs w:val="24"/>
-        </w:rPr>
-        <w:t>☐</w:t>
-      </w:r>
-      <w:r>
-        <w:rPr>
-          <w:rFonts w:cs="Calibri"/>
-          <w:sz w:val="24"/>
-          <w:szCs w:val="24"/>
-        </w:rPr>
-        <w:t xml:space="preserve">  </w:t>
-      </w:r>
-      <w:r>
-        <w:rPr>
-          <w:rFonts w:cs="Calibri"/>
-        </w:rPr>
-        <w:t>1</w:t>
-      </w:r>
-      <w:proofErr w:type="gramEnd"/>
-      <w:r>
-        <w:rPr>
-          <w:rFonts w:cs="Calibri"/>
-        </w:rPr>
-        <w:t xml:space="preserve"> heavy jacket (padded or fleece-lined)</w:t>
-      </w:r>
-    </w:p>
-    <w:p>
-      <w:pPr>
-        <w:spacing w:after="60"/>
-        <w:ind w:left="360"/>
-      </w:pPr>
-      <w:proofErr w:type="gramStart"/>
-      <w:r>
-        <w:rPr>
-          <w:rFonts w:cs="Calibri"/>
-          <w:sz w:val="24"/>
-          <w:szCs w:val="24"/>
-        </w:rPr>
-        <w:t>☐</w:t>
-      </w:r>
-      <w:r>
-        <w:rPr>
-          <w:rFonts w:cs="Calibri"/>
-          <w:sz w:val="24"/>
-          <w:szCs w:val="24"/>
-        </w:rPr>
-        <w:t xml:space="preserve">  </w:t>
-      </w:r>
-      <w:r>
-        <w:rPr>
-          <w:rFonts w:cs="Calibri"/>
-        </w:rPr>
-        <w:t>2</w:t>
-      </w:r>
-      <w:proofErr w:type="gramEnd"/>
-      <w:r>
-        <w:rPr>
-          <w:rFonts w:cs="Calibri"/>
-        </w:rPr>
-        <w:t xml:space="preserve"> sweaters / sweatshirts or fleece</w:t>
-      </w:r>
-    </w:p>
-    <w:p>
-      <w:pPr>
-        <w:spacing w:after="60"/>
-        <w:ind w:left="360"/>
-      </w:pPr>
-      <w:proofErr w:type="gramStart"/>
-      <w:r>
-        <w:rPr>
-          <w:rFonts w:cs="Calibri"/>
-          <w:sz w:val="24"/>
-          <w:szCs w:val="24"/>
-        </w:rPr>
-        <w:t>☐</w:t>
-      </w:r>
-      <w:r>
-        <w:rPr>
-          <w:rFonts w:cs="Calibri"/>
-          <w:sz w:val="24"/>
-          <w:szCs w:val="24"/>
-        </w:rPr>
-        <w:t xml:space="preserve">  </w:t>
-      </w:r>
-      <w:r>
-        <w:rPr>
-          <w:rFonts w:cs="Calibri"/>
-        </w:rPr>
-        <w:t>2</w:t>
-      </w:r>
-      <w:proofErr w:type="gramEnd"/>
-      <w:r>
-        <w:rPr>
-          <w:rFonts w:cs="Calibri"/>
-        </w:rPr>
-        <w:t xml:space="preserve"> thermal inner sets</w:t>
-      </w:r>
-    </w:p>
-    <w:p>
-      <w:pPr>
-        <w:spacing w:after="60"/>
-        <w:ind w:left="360"/>
-      </w:pPr>
-      <w:proofErr w:type="gramStart"/>
-      <w:r>
-        <w:rPr>
-          <w:rFonts w:cs="Calibri"/>
-          <w:sz w:val="24"/>
-          <w:szCs w:val="24"/>
-        </w:rPr>
-        <w:t>☐</w:t>
-      </w:r>
-      <w:r>
-        <w:rPr>
-          <w:rFonts w:cs="Calibri"/>
-          <w:sz w:val="24"/>
-          <w:szCs w:val="24"/>
-        </w:rPr>
-        <w:t xml:space="preserve">  </w:t>
-      </w:r>
-      <w:r>
-        <w:rPr>
-          <w:rFonts w:cs="Calibri"/>
-        </w:rPr>
-        <w:t>Woollen</w:t>
-      </w:r>
-      <w:proofErr w:type="gramEnd"/>
-      <w:r>
-        <w:rPr>
-          <w:rFonts w:cs="Calibri"/>
-        </w:rPr>
-        <w:t xml:space="preserve"> cap, gloves, muffler</w:t>
-      </w:r>
-    </w:p>
-    <w:p>
-      <w:pPr>
-        <w:spacing w:after="60"/>
-        <w:ind w:left="360"/>
-      </w:pPr>
-      <w:proofErr w:type="gramStart"/>
-      <w:r>
-        <w:rPr>
-          <w:rFonts w:cs="Calibri"/>
-          <w:sz w:val="24"/>
-          <w:szCs w:val="24"/>
-        </w:rPr>
-        <w:t>☐</w:t>
-      </w:r>
-      <w:r>
-        <w:rPr>
-          <w:rFonts w:cs="Calibri"/>
-          <w:sz w:val="24"/>
-          <w:szCs w:val="24"/>
-        </w:rPr>
-        <w:t xml:space="preserve">  </w:t>
-      </w:r>
-      <w:r>
-        <w:rPr>
-          <w:rFonts w:cs="Calibri"/>
-        </w:rPr>
-        <w:t>Woollen</w:t>
-      </w:r>
-      <w:proofErr w:type="gramEnd"/>
-      <w:r>
-        <w:rPr>
-          <w:rFonts w:cs="Calibri"/>
-        </w:rPr>
-        <w:t xml:space="preserve"> socks (3–4 pairs)</w:t>
-      </w:r>
-    </w:p>
-    <w:p>
-      <w:pPr>
-        <w:spacing w:after="60"/>
-        <w:ind w:left="360"/>
-      </w:pPr>
-      <w:proofErr w:type="gramStart"/>
-      <w:r>
-        <w:rPr>
-          <w:rFonts w:cs="Calibri"/>
-          <w:sz w:val="24"/>
-          <w:szCs w:val="24"/>
-        </w:rPr>
-        <w:t>☐</w:t>
-      </w:r>
-      <w:r>
-        <w:rPr>
-          <w:rFonts w:cs="Calibri"/>
-          <w:sz w:val="24"/>
-          <w:szCs w:val="24"/>
-        </w:rPr>
-        <w:t xml:space="preserve">  </w:t>
-      </w:r>
-      <w:r>
-        <w:rPr>
-          <w:rFonts w:cs="Calibri"/>
-        </w:rPr>
-        <w:t>Comfortable</w:t>
-      </w:r>
-      <w:proofErr w:type="gramEnd"/>
-      <w:r>
-        <w:rPr>
-          <w:rFonts w:cs="Calibri"/>
-        </w:rPr>
-        <w:t xml:space="preserve"> closed walking shoes / sports shoes</w:t>
-      </w:r>
-    </w:p>
-    <w:p>
-      <w:pPr>
-        <w:spacing w:after="60"/>
-        <w:ind w:left="360"/>
-      </w:pPr>
-      <w:proofErr w:type="gramStart"/>
-      <w:r>
-        <w:rPr>
-          <w:rFonts w:cs="Calibri"/>
-          <w:sz w:val="24"/>
-          <w:szCs w:val="24"/>
-        </w:rPr>
-        <w:lastRenderedPageBreak/>
-        <w:t>☐</w:t>
-      </w:r>
-      <w:r>
-        <w:rPr>
-          <w:rFonts w:cs="Calibri"/>
-          <w:sz w:val="24"/>
-          <w:szCs w:val="24"/>
-        </w:rPr>
-        <w:t xml:space="preserve">  </w:t>
-      </w:r>
-      <w:r>
-        <w:rPr>
-          <w:rFonts w:cs="Calibri"/>
-        </w:rPr>
-        <w:t>Full</w:t>
-      </w:r>
-      <w:proofErr w:type="gramEnd"/>
-      <w:r>
-        <w:rPr>
-          <w:rFonts w:cs="Calibri"/>
-        </w:rPr>
-        <w:t>-length clothing for 7 days; one set of formal or traditional wear for cultural events</w:t>
-      </w:r>
-    </w:p>
-    <w:p>
-      <w:pPr>
-        <w:spacing w:after="60"/>
-        <w:ind w:left="360"/>
-      </w:pPr>
-      <w:proofErr w:type="gramStart"/>
-      <w:r>
-        <w:rPr>
-          <w:rFonts w:cs="Calibri"/>
-          <w:sz w:val="24"/>
-          <w:szCs w:val="24"/>
-        </w:rPr>
-        <w:t>☐</w:t>
-      </w:r>
-      <w:r>
-        <w:rPr>
-          <w:rFonts w:cs="Calibri"/>
-          <w:sz w:val="24"/>
-          <w:szCs w:val="24"/>
-        </w:rPr>
-        <w:t xml:space="preserve">  </w:t>
-      </w:r>
-      <w:r>
-        <w:rPr>
-          <w:rFonts w:cs="Calibri"/>
-        </w:rPr>
-        <w:t>Moisturiser</w:t>
-      </w:r>
-      <w:proofErr w:type="gramEnd"/>
-      <w:r>
-        <w:rPr>
-          <w:rFonts w:cs="Calibri"/>
-        </w:rPr>
-        <w:t>, lip balm, sunscreen (dry air, strong sun)</w:t>
-      </w:r>
-    </w:p>
-    <w:p>
-      <w:pPr>
-        <w:spacing w:after="60"/>
-        <w:ind w:left="360"/>
-      </w:pPr>
-      <w:proofErr w:type="gramStart"/>
-      <w:r>
-        <w:rPr>
-          <w:rFonts w:cs="Calibri"/>
-          <w:sz w:val="24"/>
-          <w:szCs w:val="24"/>
-        </w:rPr>
-        <w:t>☐</w:t>
-      </w:r>
-      <w:r>
-        <w:rPr>
-          <w:rFonts w:cs="Calibri"/>
-          <w:sz w:val="24"/>
-          <w:szCs w:val="24"/>
-        </w:rPr>
-        <w:t xml:space="preserve">  </w:t>
-      </w:r>
-      <w:r>
-        <w:rPr>
-          <w:rFonts w:cs="Calibri"/>
-        </w:rPr>
-        <w:t>Personal</w:t>
-      </w:r>
-      <w:proofErr w:type="gramEnd"/>
-      <w:r>
-        <w:rPr>
-          <w:rFonts w:cs="Calibri"/>
-        </w:rPr>
-        <w:t xml:space="preserve"> medicines with prescription, plus basic firs</w:t>
-      </w:r>
-      <w:r>
-        <w:rPr>
-          <w:rFonts w:cs="Calibri"/>
-        </w:rPr>
-        <w:t>t aid</w:t>
-      </w:r>
-    </w:p>
-    <w:p>
-      <w:pPr>
-        <w:spacing w:after="60"/>
-        <w:ind w:left="360"/>
-      </w:pPr>
-      <w:proofErr w:type="gramStart"/>
-      <w:r>
-        <w:rPr>
-          <w:rFonts w:cs="Calibri"/>
-          <w:sz w:val="24"/>
-          <w:szCs w:val="24"/>
-        </w:rPr>
-        <w:t>☐</w:t>
-      </w:r>
-      <w:r>
-        <w:rPr>
-          <w:rFonts w:cs="Calibri"/>
-          <w:sz w:val="24"/>
-          <w:szCs w:val="24"/>
-        </w:rPr>
-        <w:t xml:space="preserve">  </w:t>
-      </w:r>
-      <w:r>
-        <w:rPr>
-          <w:rFonts w:cs="Calibri"/>
-        </w:rPr>
-        <w:t>Water</w:t>
-      </w:r>
-      <w:proofErr w:type="gramEnd"/>
-      <w:r>
-        <w:rPr>
-          <w:rFonts w:cs="Calibri"/>
-        </w:rPr>
-        <w:t xml:space="preserve"> bottle, small torch, umbrella or light raincoat</w:t>
-      </w:r>
-    </w:p>
-    <w:p>
-      <w:pPr>
-        <w:spacing w:after="60"/>
-        <w:ind w:left="360"/>
-      </w:pPr>
-      <w:proofErr w:type="gramStart"/>
-      <w:r>
-        <w:rPr>
-          <w:rFonts w:cs="Calibri"/>
-          <w:sz w:val="24"/>
-          <w:szCs w:val="24"/>
-        </w:rPr>
-        <w:t>☐</w:t>
-      </w:r>
-      <w:r>
-        <w:rPr>
-          <w:rFonts w:cs="Calibri"/>
-          <w:sz w:val="24"/>
-          <w:szCs w:val="24"/>
-        </w:rPr>
-        <w:t xml:space="preserve">  </w:t>
-      </w:r>
-      <w:r>
-        <w:rPr>
-          <w:rFonts w:cs="Calibri"/>
-        </w:rPr>
-        <w:t>Phone</w:t>
-      </w:r>
-      <w:proofErr w:type="gramEnd"/>
-      <w:r>
-        <w:rPr>
-          <w:rFonts w:cs="Calibri"/>
-        </w:rPr>
-        <w:t xml:space="preserve"> charger and power bank (cabin bag)</w:t>
-      </w:r>
-    </w:p>
-    <w:p>
-      <w:pPr>
-        <w:spacing w:after="60"/>
-        <w:ind w:left="360"/>
-      </w:pPr>
-      <w:proofErr w:type="gramStart"/>
-      <w:r>
-        <w:rPr>
-          <w:rFonts w:cs="Calibri"/>
-          <w:sz w:val="24"/>
-          <w:szCs w:val="24"/>
-        </w:rPr>
-        <w:t>☐</w:t>
-      </w:r>
-      <w:r>
-        <w:rPr>
-          <w:rFonts w:cs="Calibri"/>
-          <w:sz w:val="24"/>
-          <w:szCs w:val="24"/>
-        </w:rPr>
-        <w:t xml:space="preserve">  </w:t>
-      </w:r>
-      <w:r>
-        <w:rPr>
-          <w:rFonts w:cs="Calibri"/>
-        </w:rPr>
-        <w:t>Small</w:t>
-      </w:r>
-      <w:proofErr w:type="gramEnd"/>
-      <w:r>
-        <w:rPr>
-          <w:rFonts w:cs="Calibri"/>
-        </w:rPr>
-        <w:t xml:space="preserve"> backpack for day trips</w:t>
-      </w:r>
-    </w:p>
-    <w:p>
-      <w:pPr>
-        <w:pStyle w:val="Heading1"/>
-        <w:pBdr>
-          <w:bottom w:val="single" w:sz="6" w:space="2" w:color="1F4E79"/>
-        </w:pBdr>
-        <w:spacing w:before="280" w:after="120"/>
-      </w:pPr>
-      <w:r>
-        <w:rPr>
-          <w:b/>
-          <w:bCs/>
-          <w:color w:val="1F4E79"/>
-          <w:sz w:val="28"/>
-          <w:szCs w:val="28"/>
-        </w:rPr>
-        <w:t>Documents, phones and valuables</w:t>
-      </w:r>
-    </w:p>
-    <w:p>
-      <w:pPr>
-        <w:spacing w:after="120"/>
-      </w:pPr>
-      <w:r>
-        <w:rPr>
-          <w:rFonts w:cs="Calibri"/>
-        </w:rPr>
-        <w:t>Carry an original photo ID and photos; without a valid ID you will not be allowed to board.</w:t>
-      </w:r>
-    </w:p>
-    <w:p>
-      <w:pPr>
-        <w:spacing w:before="120" w:after="60"/>
-      </w:pPr>
-      <w:r>
-        <w:rPr>
-          <w:rFonts w:cs="Calibri"/>
-          <w:b/>
-          <w:bCs/>
-        </w:rPr>
-        <w:t>Documents to carry</w:t>
-      </w:r>
-    </w:p>
-    <w:p>
-      <w:pPr>
-        <w:spacing w:after="60"/>
-        <w:ind w:left="360"/>
-      </w:pPr>
-      <w:proofErr w:type="gramStart"/>
-      <w:r>
-        <w:rPr>
-          <w:rFonts w:cs="Calibri"/>
-          <w:sz w:val="24"/>
-          <w:szCs w:val="24"/>
-        </w:rPr>
-        <w:t>☐</w:t>
-      </w:r>
-      <w:r>
-        <w:rPr>
-          <w:rFonts w:cs="Calibri"/>
-          <w:sz w:val="24"/>
-          <w:szCs w:val="24"/>
-        </w:rPr>
-        <w:t xml:space="preserve">  </w:t>
-      </w:r>
-      <w:r>
-        <w:rPr>
-          <w:rFonts w:cs="Calibri"/>
-        </w:rPr>
-        <w:t>Original</w:t>
-      </w:r>
-      <w:proofErr w:type="gramEnd"/>
-      <w:r>
-        <w:rPr>
-          <w:rFonts w:cs="Calibri"/>
-        </w:rPr>
-        <w:t xml:space="preserve"> government photo ID: Aadhaar card (mandatory), plus PAN / Voter ID / Passport / Driving Licence if available</w:t>
-      </w:r>
-    </w:p>
-    <w:p>
-      <w:pPr>
-        <w:spacing w:after="60"/>
-        <w:ind w:left="360"/>
-      </w:pPr>
-      <w:proofErr w:type="gramStart"/>
-      <w:r>
-        <w:rPr>
-          <w:rFonts w:cs="Calibri"/>
-          <w:sz w:val="24"/>
-          <w:szCs w:val="24"/>
-        </w:rPr>
-        <w:t>☐</w:t>
-      </w:r>
-      <w:r>
-        <w:rPr>
-          <w:rFonts w:cs="Calibri"/>
-          <w:sz w:val="24"/>
-          <w:szCs w:val="24"/>
-        </w:rPr>
-        <w:t xml:space="preserve">  </w:t>
-      </w:r>
-      <w:r>
-        <w:rPr>
-          <w:rFonts w:cs="Calibri"/>
-        </w:rPr>
-        <w:t>College</w:t>
-      </w:r>
-      <w:proofErr w:type="gramEnd"/>
-      <w:r>
-        <w:rPr>
-          <w:rFonts w:cs="Calibri"/>
-        </w:rPr>
-        <w:t xml:space="preserve"> ID card</w:t>
-      </w:r>
-    </w:p>
-    <w:p>
-      <w:pPr>
-        <w:spacing w:after="60"/>
-        <w:ind w:left="360"/>
-      </w:pPr>
-      <w:proofErr w:type="gramStart"/>
-      <w:r>
-        <w:rPr>
-          <w:rFonts w:cs="Calibri"/>
-          <w:sz w:val="24"/>
-          <w:szCs w:val="24"/>
-        </w:rPr>
-        <w:t>☐</w:t>
-      </w:r>
-      <w:r>
-        <w:rPr>
-          <w:rFonts w:cs="Calibri"/>
-          <w:sz w:val="24"/>
-          <w:szCs w:val="24"/>
-        </w:rPr>
-        <w:t xml:space="preserve">  </w:t>
-      </w:r>
-      <w:r>
-        <w:rPr>
-          <w:rFonts w:cs="Calibri"/>
-        </w:rPr>
-        <w:t>2</w:t>
-      </w:r>
-      <w:proofErr w:type="gramEnd"/>
-      <w:r>
-        <w:rPr>
-          <w:rFonts w:cs="Calibri"/>
-        </w:rPr>
-        <w:t xml:space="preserve"> </w:t>
-      </w:r>
-      <w:r>
-        <w:rPr>
-          <w:rFonts w:cs="Calibri"/>
-        </w:rPr>
-        <w:t>photocopies of your Aadhaar and college ID</w:t>
-      </w:r>
-    </w:p>
-    <w:p>
-      <w:pPr>
-        <w:spacing w:after="60"/>
-        <w:ind w:left="360"/>
-      </w:pPr>
-      <w:proofErr w:type="gramStart"/>
-      <w:r>
-        <w:rPr>
-          <w:rFonts w:cs="Calibri"/>
-          <w:sz w:val="24"/>
-          <w:szCs w:val="24"/>
-        </w:rPr>
-        <w:t>☐</w:t>
-      </w:r>
-      <w:r>
-        <w:rPr>
-          <w:rFonts w:cs="Calibri"/>
-          <w:sz w:val="24"/>
-          <w:szCs w:val="24"/>
-        </w:rPr>
-        <w:t xml:space="preserve">  </w:t>
-      </w:r>
-      <w:r>
-        <w:rPr>
-          <w:rFonts w:cs="Calibri"/>
-        </w:rPr>
-        <w:t>4</w:t>
-      </w:r>
-      <w:proofErr w:type="gramEnd"/>
-      <w:r>
-        <w:rPr>
-          <w:rFonts w:cs="Calibri"/>
-        </w:rPr>
-        <w:t xml:space="preserve"> recent passport-size photographs</w:t>
-      </w:r>
-    </w:p>
-    <w:p>
-      <w:pPr>
-        <w:spacing w:after="60"/>
-        <w:ind w:left="360"/>
-      </w:pPr>
-      <w:proofErr w:type="gramStart"/>
-      <w:r>
-        <w:rPr>
-          <w:rFonts w:cs="Calibri"/>
-          <w:sz w:val="24"/>
-          <w:szCs w:val="24"/>
-        </w:rPr>
-        <w:t>☐</w:t>
-      </w:r>
-      <w:r>
-        <w:rPr>
-          <w:rFonts w:cs="Calibri"/>
-          <w:sz w:val="24"/>
-          <w:szCs w:val="24"/>
-        </w:rPr>
-        <w:t xml:space="preserve">  </w:t>
-      </w:r>
-      <w:r>
-        <w:rPr>
-          <w:rFonts w:cs="Calibri"/>
-        </w:rPr>
-        <w:t>Gate</w:t>
-      </w:r>
-      <w:proofErr w:type="gramEnd"/>
-      <w:r>
-        <w:rPr>
-          <w:rFonts w:cs="Calibri"/>
-        </w:rPr>
-        <w:t xml:space="preserve"> pass (from email) and boarding pass – on phone and printed</w:t>
-      </w:r>
-    </w:p>
-    <w:p>
-      <w:pPr>
-        <w:spacing w:after="60"/>
-        <w:ind w:left="360"/>
-      </w:pPr>
-      <w:proofErr w:type="gramStart"/>
-      <w:r>
-        <w:rPr>
-          <w:rFonts w:cs="Calibri"/>
-          <w:sz w:val="24"/>
-          <w:szCs w:val="24"/>
-        </w:rPr>
-        <w:t>☐</w:t>
-      </w:r>
-      <w:r>
-        <w:rPr>
-          <w:rFonts w:cs="Calibri"/>
-          <w:sz w:val="24"/>
-          <w:szCs w:val="24"/>
-        </w:rPr>
-        <w:t xml:space="preserve">  </w:t>
-      </w:r>
-      <w:r>
-        <w:rPr>
-          <w:rFonts w:cs="Calibri"/>
-        </w:rPr>
-        <w:t>Signed</w:t>
-      </w:r>
-      <w:proofErr w:type="gramEnd"/>
-      <w:r>
-        <w:rPr>
-          <w:rFonts w:cs="Calibri"/>
-        </w:rPr>
-        <w:t xml:space="preserve"> undertaking form (see below)</w:t>
-      </w:r>
-    </w:p>
-    <w:p>
-      <w:pPr>
-        <w:spacing w:before="160" w:after="60"/>
-      </w:pPr>
-      <w:r>
-        <w:rPr>
-          <w:rFonts w:cs="Calibri"/>
-          <w:b/>
-          <w:bCs/>
-        </w:rPr>
-        <w:t>Mobile phones</w:t>
-      </w:r>
-    </w:p>
-    <w:p>
-      <w:pPr>
-        <w:spacing w:after="120"/>
-      </w:pPr>
-      <w:r>
-        <w:rPr>
-          <w:rFonts w:cs="Calibri"/>
-        </w:rPr>
-        <w:t xml:space="preserve">Only </w:t>
-      </w:r>
-      <w:proofErr w:type="spellStart"/>
-      <w:r>
-        <w:rPr>
-          <w:rFonts w:cs="Calibri"/>
-          <w:b/>
-          <w:bCs/>
-        </w:rPr>
         <w:t>postpaid</w:t>
       </w:r>
-      <w:proofErr w:type="spellEnd"/>
-      <w:r>
-        <w:rPr>
-          <w:rFonts w:cs="Calibri"/>
-        </w:rPr>
-        <w:t xml:space="preserve"> SIM cards work in Jammu &amp; Kashmir. Prepai</w:t>
-      </w:r>
-      <w:r>
-        <w:rPr>
-          <w:rFonts w:cs="Calibri"/>
-        </w:rPr>
-        <w:t xml:space="preserve">d SIMs from other states do not work there. If you have only a prepaid connection, convert it to </w:t>
-      </w:r>
-      <w:proofErr w:type="spellStart"/>
-      <w:r>
-        <w:rPr>
-          <w:rFonts w:cs="Calibri"/>
-        </w:rPr>
-        <w:t>postpaid</w:t>
-      </w:r>
-      <w:proofErr w:type="spellEnd"/>
-      <w:r>
-        <w:rPr>
-          <w:rFonts w:cs="Calibri"/>
-        </w:rPr>
-        <w:t xml:space="preserve"> or arrange a </w:t>
-      </w:r>
-      <w:proofErr w:type="spellStart"/>
-      <w:r>
-        <w:rPr>
-          <w:rFonts w:cs="Calibri"/>
-        </w:rPr>
-        <w:t>postpaid</w:t>
-      </w:r>
-      <w:proofErr w:type="spellEnd"/>
-      <w:r>
-        <w:rPr>
-          <w:rFonts w:cs="Calibri"/>
-        </w:rPr>
-        <w:t xml:space="preserve"> SIM before 20 October. Share a parent's number with your coordinator as an emergency contact.</w:t>
+      <w:r>
+        <w:rPr>
+          <w:rFonts w:cs="Calibri"/>
+        </w:rPr>
+        <w:t xml:space="preserve"> SIM cards work in Jammu &amp; Kashmir. Prepaid SIMs from other states do not work there. If you have only a prepaid connection, convert it to postpaid or arrange a postpaid SIM before 20 October. Share a parent's number with your coordinator as an emergency contact.</w:t>
       </w:r>
     </w:p>
     <w:p>
@@ -3574,10 +2995,7 @@
         <w:spacing w:after="60"/>
       </w:pPr>
       <w:r>
-        <w:t>Carry a debit card / UPI an</w:t>
-      </w:r>
-      <w:r>
-        <w:t>d a small amount of cash for personal expenses.</w:t>
+        <w:t>Carry a debit card / UPI and a small amount of cash for personal expenses.</w:t>
       </w:r>
     </w:p>
     <w:p>
@@ -3634,10 +3052,7 @@
         <w:spacing w:after="60"/>
       </w:pPr>
       <w:r>
-        <w:t>Plan your onward</w:t>
-      </w:r>
-      <w:r>
-        <w:t xml:space="preserve"> train, bus or ride home in advance, keeping a buffer for flight delays.</w:t>
+        <w:t>Plan your onward train, bus or ride home in advance, keeping a buffer for flight delays.</w:t>
       </w:r>
     </w:p>
     <w:p>
@@ -3663,10 +3078,7 @@
         <w:spacing w:after="60"/>
       </w:pPr>
       <w:r>
-        <w:t>Tell your family the expected landing time so someone can pick you up if nee</w:t>
-      </w:r>
-      <w:r>
-        <w:t>ded.</w:t>
+        <w:t>Tell your family the expected landing time so someone can pick you up if needed.</w:t>
       </w:r>
     </w:p>
     <w:p>
@@ -3726,8 +3138,6 @@
         </w:rPr>
         <w:t>Form – Will provide form link in some time</w:t>
       </w:r>
-      <w:bookmarkStart w:id="0" w:name="_GoBack"/>
-      <w:bookmarkEnd w:id="0"/>
     </w:p>
     <w:sectPr>
       <w:pgSz w:w="11906" w:h="16838"/>

</xml_diff>